<commit_message>
Update capstone report and add-on modules
</commit_message>
<xml_diff>
--- a/docs/Demo_Web_Shop_Capstone_Day_Wise_Testing_Plan.docx
+++ b/docs/Demo_Web_Shop_Capstone_Day_Wise_Testing_Plan.docx
@@ -84,7 +84,7 @@
           <w:color w:val="141F2D"/>
           <w:sz w:val="24"/>
         </w:rPr>
-        <w:t>Final Coverage: 8 services, 120 test cases, 360 passed executions</w:t>
+        <w:t>Final Coverage: 6 core modules and 2 add-on modules, 120 test cases, 360 passed executions</w:t>
       </w:r>
     </w:p>
     <w:p/>
@@ -467,7 +467,7 @@
           <w:color w:val="141F2D"/>
           <w:sz w:val="22"/>
         </w:rPr>
-        <w:t>The project satisfies the capstone requirement of minimum 8 services and minimum 120 test cases. Each service contains 15 unique test cases. The complete suite runs on Chromium, Firefox, and WebKit, producing 360 cross-browser executions in the final Allure report.</w:t>
+        <w:t>The project satisfies the capstone requirement of 6 core modules and 2 add-on modules and minimum 120 test cases. Each service contains 15 unique test cases. The complete suite runs on Chromium, Firefox, and WebKit, producing 360 cross-browser executions in the final Allure report.</w:t>
       </w:r>
     </w:p>
     <w:p>
@@ -602,7 +602,7 @@
                 <w:color w:val="141F2D"/>
                 <w:sz w:val="18"/>
               </w:rPr>
-              <w:t>8 services completed</w:t>
+              <w:t>6 core modules and 2 add-on modules completed</w:t>
             </w:r>
           </w:p>
         </w:tc>
@@ -3238,7 +3238,7 @@
                 <w:color w:val="141F2D"/>
                 <w:sz w:val="16"/>
               </w:rPr>
-              <w:t>Checkout and Payment</w:t>
+              <w:t>Add on - Checkout and Payment</w:t>
             </w:r>
           </w:p>
         </w:tc>
@@ -3290,7 +3290,7 @@
                 <w:color w:val="141F2D"/>
                 <w:sz w:val="16"/>
               </w:rPr>
-              <w:t>tests/checkout-payment</w:t>
+              <w:t>tests/add-on-checkout-payment</w:t>
             </w:r>
           </w:p>
         </w:tc>
@@ -3344,7 +3344,7 @@
                 <w:color w:val="141F2D"/>
                 <w:sz w:val="16"/>
               </w:rPr>
-              <w:t>Customer Support and Information</w:t>
+              <w:t>Add on - Customer Support and Information</w:t>
             </w:r>
           </w:p>
         </w:tc>
@@ -3396,7 +3396,7 @@
                 <w:color w:val="141F2D"/>
                 <w:sz w:val="16"/>
               </w:rPr>
-              <w:t>tests/customer-support</w:t>
+              <w:t>tests/add-on-customer-support</w:t>
             </w:r>
           </w:p>
         </w:tc>
@@ -3604,7 +3604,7 @@
           <w:color w:val="1F4D78"/>
           <w:sz w:val="24"/>
         </w:rPr>
-        <w:t>Checkout and Payment</w:t>
+        <w:t>Add on - Checkout and Payment</w:t>
       </w:r>
     </w:p>
     <w:p>
@@ -3629,7 +3629,7 @@
           <w:color w:val="1F4D78"/>
           <w:sz w:val="24"/>
         </w:rPr>
-        <w:t>Customer Support and Information</w:t>
+        <w:t>Add on - Customer Support and Information</w:t>
       </w:r>
     </w:p>
     <w:p>
@@ -3829,7 +3829,7 @@
                 <w:color w:val="141F2D"/>
                 <w:sz w:val="16"/>
               </w:rPr>
-              <w:t>Contains 8 service-wise folders and 120 visible spec files.</w:t>
+              <w:t>Contains 6 core module folders, 2 add-on module folders, and 120 visible spec files.</w:t>
             </w:r>
           </w:p>
         </w:tc>
@@ -5177,7 +5177,7 @@
           <w:color w:val="141F2D"/>
           <w:sz w:val="22"/>
         </w:rPr>
-        <w:t>8 service folders are present under tests.</w:t>
+        <w:t>6 core module folders and 2 add-on module folders are present under tests.</w:t>
       </w:r>
     </w:p>
     <w:p>
@@ -5300,7 +5300,7 @@
           <w:color w:val="141F2D"/>
           <w:sz w:val="22"/>
         </w:rPr>
-        <w:t>The day-wise capstone plan shows a clear progression from project setup to full service coverage, CI/CD deployment, and final reporting. The project now meets the trainer requirement with 8 services, 120 Playwright JavaScript test cases, and a hosted Allure report showing 360 passed cross-browser executions.</w:t>
+        <w:t>The day-wise capstone plan shows a clear progression from project setup to full service coverage, CI/CD deployment, and final reporting. The project now meets the trainer requirement with 6 core modules and 2 add-on modules, 120 Playwright JavaScript test cases, and a hosted Allure report showing 360 passed cross-browser executions.</w:t>
       </w:r>
     </w:p>
     <w:p>
@@ -5622,7 +5622,7 @@
                 <w:b w:val="0"/>
                 <w:sz w:val="19"/>
               </w:rPr>
-              <w:t>8 services, 15 test cases each, 120 test cases total</w:t>
+              <w:t>6 core modules and 2 add-on modules, 15 test cases each, 120 test cases total</w:t>
             </w:r>
           </w:p>
         </w:tc>
@@ -6825,7 +6825,7 @@
                 <w:b w:val="0"/>
                 <w:sz w:val="19"/>
               </w:rPr>
-              <w:t>Checkout and Payment</w:t>
+              <w:t>Add on - Checkout and Payment</w:t>
             </w:r>
           </w:p>
         </w:tc>
@@ -6863,7 +6863,7 @@
                 <w:b w:val="0"/>
                 <w:sz w:val="19"/>
               </w:rPr>
-              <w:t>tests/checkout-payment</w:t>
+              <w:t>tests/add-on-checkout-payment</w:t>
             </w:r>
           </w:p>
         </w:tc>
@@ -6904,7 +6904,7 @@
                 <w:b w:val="0"/>
                 <w:sz w:val="19"/>
               </w:rPr>
-              <w:t>Customer Support and Information</w:t>
+              <w:t>Add on - Customer Support and Information</w:t>
             </w:r>
           </w:p>
         </w:tc>
@@ -6942,7 +6942,7 @@
                 <w:b w:val="0"/>
                 <w:sz w:val="19"/>
               </w:rPr>
-              <w:t>tests/customer-support</w:t>
+              <w:t>tests/add-on-customer-support</w:t>
             </w:r>
           </w:p>
         </w:tc>

</xml_diff>